<commit_message>
Update introduction and problem statement in documentation to clarify system features and improve readability
</commit_message>
<xml_diff>
--- a/Documentations/CHAPTER-1mao-ni-revise-jam_updated.docx
+++ b/Documentations/CHAPTER-1mao-ni-revise-jam_updated.docx
@@ -62,127 +62,127 @@
         <w:rPr>
           <w:rFonts w:ascii="Times New Roman" w:hAnsi="Times New Roman" w:cs="Times New Roman"/>
         </w:rPr>
+        <w:t xml:space="preserve">Gyms handle many day-to-day activities, including keeping member records, accepting membership applications, monitoring payments and attendance, managing products, and preparing reports. GymMaster reports more than 180,000 active weekly users and use in over 90 countries (GymMaster, n.d.). GYMMANAGER states that it operates in 22 countries and separately reports more than 600 automated gyms; its platform also describes booking, payment processing, access control, and an AI assistant for business insights (GYMMANAGER, n.d.-a, n.d.-b). These existing systems show that gym management software ranges from membership tracking to more automated platforms. When gym activities rely on separate paper forms, logbooks, or files, information can be difficult to find and keep consistent. Staff may need to search several records to confirm a member’s status, review attendance, or verify a transaction. Handwritten entries and repeated data entry can also lead to incomplete or conflicting records.</w:t>
+      </w:r>
+      <w:r>
+        <w:rPr>
+          <w:rFonts w:ascii="Times New Roman" w:hAnsi="Times New Roman" w:cs="Times New Roman"/>
+        </w:rPr>
+        <w:t/>
+      </w:r>
+      <w:r>
+        <w:t xml:space="preserve"/>
+      </w:r>
+      <w:proofErr w:type="spellStart"/>
+      <w:r>
+        <w:rPr>
+          <w:rFonts w:ascii="Times New Roman" w:hAnsi="Times New Roman" w:cs="Times New Roman"/>
+        </w:rPr>
+        <w:t/>
+      </w:r>
+      <w:proofErr w:type="spellEnd"/>
+      <w:r>
+        <w:rPr>
+          <w:rFonts w:ascii="Times New Roman" w:hAnsi="Times New Roman" w:cs="Times New Roman"/>
+        </w:rPr>
+        <w:t/>
+      </w:r>
+      <w:r>
+        <w:t xml:space="preserve"/>
+      </w:r>
+      <w:r>
+        <w:rPr>
+          <w:rFonts w:ascii="Times New Roman" w:hAnsi="Times New Roman" w:cs="Times New Roman"/>
+        </w:rPr>
+        <w:t xml:space="preserve"/>
+      </w:r>
+      <w:r>
+        <w:rPr>
+          <w:rFonts w:ascii="Times New Roman" w:hAnsi="Times New Roman" w:cs="Times New Roman"/>
+        </w:rPr>
+        <w:t xml:space="preserve"/>
+      </w:r>
+      <w:r>
+        <w:t xml:space="preserve"/>
+      </w:r>
+      <w:r>
+        <w:rPr>
+          <w:rFonts w:ascii="Times New Roman" w:hAnsi="Times New Roman" w:cs="Times New Roman"/>
+        </w:rPr>
+        <w:t/>
+      </w:r>
+    </w:p>
+    <w:p>
+      <w:pPr>
+        <w:spacing w:line="480" w:lineRule="auto"/>
+        <w:jc w:val="both"/>
+        <w:rPr>
+          <w:rFonts w:ascii="Times New Roman" w:hAnsi="Times New Roman" w:cs="Times New Roman"/>
+        </w:rPr>
+      </w:pPr>
+      <w:r>
+        <w:rPr>
+          <w:rFonts w:ascii="Times New Roman" w:hAnsi="Times New Roman" w:cs="Times New Roman"/>
+        </w:rPr>
         <w:t xml:space="preserve">          </w:t>
       </w:r>
       <w:r>
         <w:rPr>
           <w:rFonts w:ascii="Times New Roman" w:hAnsi="Times New Roman" w:cs="Times New Roman"/>
         </w:rPr>
-        <w:t>Gyms handle many day-to-day activities, including keeping member records, accepting membership applications, monitoring payments and attendance, managing products, and preparing reports.</w:t>
-      </w:r>
-      <w:r>
-        <w:t xml:space="preserve"> </w:t>
+        <w:t xml:space="preserve">Iron Grind Fitness Gym is located in Purok Mangga, </w:t>
       </w:r>
       <w:proofErr w:type="spellStart"/>
       <w:r>
         <w:rPr>
           <w:rFonts w:ascii="Times New Roman" w:hAnsi="Times New Roman" w:cs="Times New Roman"/>
         </w:rPr>
-        <w:t>GymMaster</w:t>
+        <w:t>Sulangon</w:t>
       </w:r>
       <w:proofErr w:type="spellEnd"/>
       <w:r>
         <w:rPr>
           <w:rFonts w:ascii="Times New Roman" w:hAnsi="Times New Roman" w:cs="Times New Roman"/>
         </w:rPr>
-        <w:t>, used by gyms in over 90 countries with more than 180,000 active users weekly, offers an all-in-one platform combining 24/7 access control, automated billing, point-of-sale, and a member-facing mobile application.</w:t>
-      </w:r>
-      <w:r>
-        <w:t xml:space="preserve"> </w:t>
-      </w:r>
-      <w:r>
-        <w:rPr>
-          <w:rFonts w:ascii="Times New Roman" w:hAnsi="Times New Roman" w:cs="Times New Roman"/>
-        </w:rPr>
-        <w:t xml:space="preserve"> </w:t>
-      </w:r>
-      <w:r>
-        <w:rPr>
-          <w:rFonts w:ascii="Times New Roman" w:hAnsi="Times New Roman" w:cs="Times New Roman"/>
-        </w:rPr>
-        <w:t xml:space="preserve">Meanwhile, GYMMANAGER, a system currently serving more than 600 clubs across 22 countries, integrates booking, payment processing, and access control with an AI-powered business assistant that generates real-time operational insights. These existing systems show that gym management software has evolved into a wide range of solutions, from basic membership tracking to fully automated platforms. </w:t>
-      </w:r>
-      <w:r>
-        <w:t xml:space="preserve"> </w:t>
-      </w:r>
-      <w:r>
-        <w:rPr>
-          <w:rFonts w:ascii="Times New Roman" w:hAnsi="Times New Roman" w:cs="Times New Roman"/>
-        </w:rPr>
-        <w:t>When these activities rely on separate paper forms, logbooks, or files, information can be difficult to find and keep consistent. Staff may need to search several records to confirm a member’s status, review attendance, or verify a transaction. Handwritten entries and repeated data entry can also lead to incomplete or conflicting records.</w:t>
-      </w:r>
-    </w:p>
-    <w:p>
-      <w:pPr>
-        <w:spacing w:line="480" w:lineRule="auto"/>
-        <w:jc w:val="both"/>
-        <w:rPr>
-          <w:rFonts w:ascii="Times New Roman" w:hAnsi="Times New Roman" w:cs="Times New Roman"/>
-        </w:rPr>
-      </w:pPr>
-      <w:r>
-        <w:rPr>
-          <w:rFonts w:ascii="Times New Roman" w:hAnsi="Times New Roman" w:cs="Times New Roman"/>
-        </w:rPr>
-        <w:t xml:space="preserve">          </w:t>
-      </w:r>
-      <w:r>
-        <w:rPr>
-          <w:rFonts w:ascii="Times New Roman" w:hAnsi="Times New Roman" w:cs="Times New Roman"/>
-        </w:rPr>
-        <w:t xml:space="preserve">Iron Grind Fitness Gym is located in Purok Mangga, </w:t>
+        <w:t>, Dapitan City, Zamboanga del Norte. It serves people with different fitness goals and offers membership plans, fitness-related guidance, supplements, and gym merchandise. Its operations require the gym owner and staff to maintain accurate information about members, applications, membership periods, attendance, products, and sales.</w:t>
+      </w:r>
+    </w:p>
+    <w:p>
+      <w:pPr>
+        <w:spacing w:line="480" w:lineRule="auto"/>
+        <w:jc w:val="both"/>
+        <w:rPr>
+          <w:rFonts w:ascii="Times New Roman" w:hAnsi="Times New Roman" w:cs="Times New Roman"/>
+        </w:rPr>
+      </w:pPr>
+      <w:r>
+        <w:rPr>
+          <w:rFonts w:ascii="Times New Roman" w:hAnsi="Times New Roman" w:cs="Times New Roman"/>
+        </w:rPr>
+        <w:lastRenderedPageBreak/>
+        <w:t xml:space="preserve">To support these activities, the proponents developed IronGrind: A Web-Based Fitness Gym Membership and Operations Management System. The system provides a common sign-in page, an online membership registration page, an admin dashboard, and a member dashboard. New applicants can submit their information online, while an administrator reviews each application and approves or rejects it. Members can view their membership status, membership-period progress, attendance history, and QR code, and can submit a renewal request when eligible.</w:t>
+      </w:r>
+      <w:r>
+        <w:rPr>
+          <w:rFonts w:ascii="Times New Roman" w:hAnsi="Times New Roman" w:cs="Times New Roman"/>
+        </w:rPr>
+        <w:t xml:space="preserve"/>
       </w:r>
       <w:proofErr w:type="spellStart"/>
       <w:r>
         <w:rPr>
           <w:rFonts w:ascii="Times New Roman" w:hAnsi="Times New Roman" w:cs="Times New Roman"/>
-        </w:rPr>
-        <w:t>Sulangon</w:t>
+          <w:b/>
+          <w:bCs/>
+        </w:rPr>
+        <w:t/>
       </w:r>
       <w:proofErr w:type="spellEnd"/>
       <w:r>
         <w:rPr>
           <w:rFonts w:ascii="Times New Roman" w:hAnsi="Times New Roman" w:cs="Times New Roman"/>
         </w:rPr>
-        <w:t>, Dapitan City, Zamboanga del Norte. It serves people with different fitness goals and offers membership plans, fitness-related guidance, supplements, and gym merchandise. Its operations require the gym owner and staff to maintain accurate information about members, applications, membership periods, attendance, products, and sales.</w:t>
-      </w:r>
-    </w:p>
-    <w:p>
-      <w:pPr>
-        <w:spacing w:line="480" w:lineRule="auto"/>
-        <w:jc w:val="both"/>
-        <w:rPr>
-          <w:rFonts w:ascii="Times New Roman" w:hAnsi="Times New Roman" w:cs="Times New Roman"/>
-        </w:rPr>
-      </w:pPr>
-      <w:r>
-        <w:rPr>
-          <w:rFonts w:ascii="Times New Roman" w:hAnsi="Times New Roman" w:cs="Times New Roman"/>
-        </w:rPr>
-        <w:lastRenderedPageBreak/>
-        <w:t xml:space="preserve">           </w:t>
-      </w:r>
-      <w:r>
-        <w:rPr>
-          <w:rFonts w:ascii="Times New Roman" w:hAnsi="Times New Roman" w:cs="Times New Roman"/>
-        </w:rPr>
-        <w:t xml:space="preserve">To support these activities, the proponents developed </w:t>
-      </w:r>
-      <w:proofErr w:type="spellStart"/>
-      <w:r>
-        <w:rPr>
-          <w:rFonts w:ascii="Times New Roman" w:hAnsi="Times New Roman" w:cs="Times New Roman"/>
-          <w:b/>
-          <w:bCs/>
-        </w:rPr>
-        <w:t>IronGrind</w:t>
-      </w:r>
-      <w:proofErr w:type="spellEnd"/>
-      <w:r>
-        <w:rPr>
-          <w:rFonts w:ascii="Times New Roman" w:hAnsi="Times New Roman" w:cs="Times New Roman"/>
-        </w:rPr>
-        <w:t>: A Web-Based Gym Membership and Operations Management System. The system provides a common sign-in page, an online membership registration page, an admin dashboard, and a member dashboard. New applicants can submit their information online, while an administrator reviews each application and approves or rejects it. Members can view their membership status, membership-period progress, attendance history, and QR code, and can submit a renewal request when eligible.</w:t>
+        <w:t/>
       </w:r>
     </w:p>
     <w:p>
@@ -332,28 +332,28 @@
         <w:rPr>
           <w:rFonts w:ascii="Times New Roman" w:hAnsi="Times New Roman" w:cs="Times New Roman"/>
         </w:rPr>
-        <w:t>The gym also needs to manage supplement and merchandise stock and sales, including products sold by weight and shirts available in different sizes. Manual records can make it difficult to track current quantities, record sales, and identify items that need restocking. Since the gym does not process online payments, customers must complete their purchases in person. The gym therefore needs a way to keep product, reservation, and sales information organized while maintaining in-person payment.</w:t>
-      </w:r>
-    </w:p>
-    <w:p>
-      <w:pPr>
-        <w:spacing w:line="480" w:lineRule="auto"/>
-        <w:jc w:val="both"/>
-        <w:rPr>
-          <w:rFonts w:ascii="Times New Roman" w:hAnsi="Times New Roman" w:cs="Times New Roman"/>
-        </w:rPr>
-      </w:pPr>
-      <w:r>
-        <w:rPr>
-          <w:rFonts w:ascii="Times New Roman" w:hAnsi="Times New Roman" w:cs="Times New Roman"/>
-        </w:rPr>
-        <w:t xml:space="preserve">        </w:t>
-      </w:r>
-      <w:r>
-        <w:rPr>
-          <w:rFonts w:ascii="Times New Roman" w:hAnsi="Times New Roman" w:cs="Times New Roman"/>
-        </w:rPr>
-        <w:t xml:space="preserve">To address these concerns, the study focuses on developing </w:t>
+        <w:t xml:space="preserve">The gym also needs to manage supplement and merchandise stock and sales, including products sold by weight and shirts available in different sizes. Manual records can make it difficult to track current quantities, record sales, and identify items that need restocking. Since the gym does not process online payments, customers must complete purchases in person. The gym therefore needs a way to organize product and sales information while maintaining in-person payment.</w:t>
+      </w:r>
+    </w:p>
+    <w:p>
+      <w:pPr>
+        <w:spacing w:line="480" w:lineRule="auto"/>
+        <w:jc w:val="both"/>
+        <w:rPr>
+          <w:rFonts w:ascii="Times New Roman" w:hAnsi="Times New Roman" w:cs="Times New Roman"/>
+        </w:rPr>
+      </w:pPr>
+      <w:r>
+        <w:rPr>
+          <w:rFonts w:ascii="Times New Roman" w:hAnsi="Times New Roman" w:cs="Times New Roman"/>
+        </w:rPr>
+        <w:t xml:space="preserve">To address these concerns, the study focuses on developing IronGrind: A Web-Based Fitness Gym Membership and Operations Management System. The system brings together member and membership records, registration and renewal requests, payment tracking, QR code attendance, inventory, in-store product availability, sales, and reports. It is intended to help the gym admin manage these operations through a centralized platform and give members access to relevant account and membership information.</w:t>
+      </w:r>
+      <w:r>
+        <w:rPr>
+          <w:rFonts w:ascii="Times New Roman" w:hAnsi="Times New Roman" w:cs="Times New Roman"/>
+        </w:rPr>
+        <w:t xml:space="preserve"/>
       </w:r>
       <w:proofErr w:type="spellStart"/>
       <w:r>
@@ -362,14 +362,14 @@
           <w:b/>
           <w:bCs/>
         </w:rPr>
-        <w:t>IronGrind</w:t>
+        <w:t/>
       </w:r>
       <w:proofErr w:type="spellEnd"/>
       <w:r>
         <w:rPr>
           <w:rFonts w:ascii="Times New Roman" w:hAnsi="Times New Roman" w:cs="Times New Roman"/>
         </w:rPr>
-        <w:t>: A Web-Based Gym Management and Fitness Monitoring System. The system brings together member and membership records, registration and renewal requests, payment tracking, QR code attendance, inventory, reservations, sales, and reports. It is intended to help the gym admin manage these operations through a centralized platform and give members access to relevant account and membership information.</w:t>
+        <w:t/>
       </w:r>
     </w:p>
     <w:p>
@@ -461,7 +461,7 @@
         <w:rPr>
           <w:rFonts w:ascii="Times New Roman" w:hAnsi="Times New Roman" w:cs="Times New Roman"/>
         </w:rPr>
-        <w:t>How can the system help manage supplement and merchandise products, stock quantities, reservations, and in-person sales?</w:t>
+        <w:t xml:space="preserve">How can the system help manage supplement and merchandise products, stock quantities, and in-person sales?</w:t>
       </w:r>
     </w:p>
     <w:p>
@@ -787,27 +787,27 @@
         <w:rPr>
           <w:rFonts w:ascii="Times New Roman" w:hAnsi="Times New Roman" w:cs="Times New Roman"/>
         </w:rPr>
-        <w:t xml:space="preserve">         </w:t>
-      </w:r>
-      <w:r>
-        <w:rPr>
-          <w:rFonts w:ascii="Times New Roman" w:hAnsi="Times New Roman" w:cs="Times New Roman"/>
-        </w:rPr>
-        <w:t xml:space="preserve">The system is intended for Iron Grind Fitness Gym and does not provide multi-gym operations. Its usefulness depends on accurate information entered by authorized users, a working internet connection, and the availability of the </w:t>
+        <w:t xml:space="preserve">The system is intended for Iron Grind Fitness Gym and does not provide multi-gym operations. Its usefulness depends on accurate information entered by authorized users, a working internet connection, and the availability of the Supabase services used by the website. Automated operational notifications, such as application-status updates and membership-expiry reminders, and external messaging are outside the scope of this version. Supabase Auth supports account-confirmation and password-reset emails when those flows are enabled in the project configuration.</w:t>
+      </w:r>
+      <w:r>
+        <w:rPr>
+          <w:rFonts w:ascii="Times New Roman" w:hAnsi="Times New Roman" w:cs="Times New Roman"/>
+        </w:rPr>
+        <w:t xml:space="preserve"/>
       </w:r>
       <w:proofErr w:type="spellStart"/>
       <w:r>
         <w:rPr>
           <w:rFonts w:ascii="Times New Roman" w:hAnsi="Times New Roman" w:cs="Times New Roman"/>
         </w:rPr>
-        <w:t>Supabase</w:t>
+        <w:t/>
       </w:r>
       <w:proofErr w:type="spellEnd"/>
       <w:r>
         <w:rPr>
           <w:rFonts w:ascii="Times New Roman" w:hAnsi="Times New Roman" w:cs="Times New Roman"/>
         </w:rPr>
-        <w:t xml:space="preserve"> services used by the website. Notifications and external messaging are outside the scope of this version.</w:t>
+        <w:t xml:space="preserve"/>
       </w:r>
     </w:p>
     <w:p>
@@ -1550,6 +1550,29 @@
           <w:rFonts w:ascii="Times New Roman" w:hAnsi="Times New Roman" w:cs="Times New Roman"/>
         </w:rPr>
       </w:pPr>
+    </w:p>
+    <w:p>
+      <w:pPr>
+        <w:pStyle w:val="Heading1"/>
+      </w:pPr>
+      <w:r>
+        <w:t xml:space="preserve">References</w:t>
+      </w:r>
+    </w:p>
+    <w:p>
+      <w:r>
+        <w:t xml:space="preserve">GymMaster. (n.d.). About us. https://www.gymmaster.com/about-us/</w:t>
+      </w:r>
+    </w:p>
+    <w:p>
+      <w:r>
+        <w:t xml:space="preserve">GYMMANAGER. (n.d.-a). Automation of the fitness club. https://automaticgym.gymmanager.io/</w:t>
+      </w:r>
+    </w:p>
+    <w:p>
+      <w:r>
+        <w:t xml:space="preserve">GYMMANAGER. (n.d.-b). Gym management software. https://gymmanager.io/</w:t>
+      </w:r>
     </w:p>
     <w:sectPr>
       <w:pgSz w:w="12240" w:h="15840"/>

</xml_diff>